<commit_message>
front end code reorganisation
</commit_message>
<xml_diff>
--- a/Usecases/20250519 - PREMIERE DEMO famille.docx
+++ b/Usecases/20250519 - PREMIERE DEMO famille.docx
@@ -5,12 +5,277 @@
     <w:p>
       <w:pPr>
         <w:pStyle w:val="Heading1"/>
-      </w:pPr>
-      <w:r>
+        <w:rPr>
+          <w:lang w:val="fr-BE"/>
+        </w:rPr>
+      </w:pPr>
+      <w:r>
+        <w:rPr>
+          <w:lang w:val="fr-BE"/>
+        </w:rPr>
         <w:t>Feedback</w:t>
       </w:r>
     </w:p>
     <w:p>
+      <w:pPr>
+        <w:rPr>
+          <w:lang w:val="fr-BE"/>
+        </w:rPr>
+      </w:pPr>
+      <w:r>
+        <w:rPr>
+          <w:lang w:val="fr-BE"/>
+        </w:rPr>
+        <w:t>Feedback collaboratif :</w:t>
+      </w:r>
+    </w:p>
+    <w:p>
+      <w:pPr>
+        <w:pStyle w:val="NormalWeb"/>
+        <w:shd w:val="clear" w:color="auto" w:fill="FFFFFF"/>
+        <w:spacing w:before="0" w:beforeAutospacing="0" w:after="0" w:afterAutospacing="0"/>
+        <w:rPr>
+          <w:rFonts w:ascii="Consolas" w:hAnsi="Consolas"/>
+          <w:color w:val="000000"/>
+          <w:sz w:val="20"/>
+          <w:szCs w:val="20"/>
+          <w:lang w:val="fr-BE"/>
+        </w:rPr>
+      </w:pPr>
+      <w:r>
+        <w:rPr>
+          <w:rFonts w:ascii="Consolas" w:hAnsi="Consolas"/>
+          <w:color w:val="000000"/>
+          <w:sz w:val="20"/>
+          <w:szCs w:val="20"/>
+          <w:lang w:val="fr-BE"/>
+        </w:rPr>
+        <w:t>C'est amusant, et permet d'être créatif.Peut être faire le timer en 2 temps : 1 temps pour écrire sa réponse et puis un temps pour promouvoir sa réponse, celle des autres, et "voter" .</w:t>
+      </w:r>
+    </w:p>
+    <w:p>
+      <w:pPr>
+        <w:pStyle w:val="NormalWeb"/>
+        <w:shd w:val="clear" w:color="auto" w:fill="FFFFFF"/>
+        <w:spacing w:before="0" w:beforeAutospacing="0" w:after="0" w:afterAutospacing="0"/>
+        <w:rPr>
+          <w:rFonts w:ascii="Consolas" w:hAnsi="Consolas"/>
+          <w:color w:val="000000"/>
+          <w:sz w:val="20"/>
+          <w:szCs w:val="20"/>
+          <w:lang w:val="fr-BE"/>
+        </w:rPr>
+      </w:pPr>
+      <w:r>
+        <w:rPr>
+          <w:rFonts w:ascii="Consolas" w:hAnsi="Consolas"/>
+          <w:color w:val="000000"/>
+          <w:sz w:val="20"/>
+          <w:szCs w:val="20"/>
+          <w:lang w:val="fr-BE"/>
+        </w:rPr>
+        <w:t>Quelques problèmes d'affichage</w:t>
+      </w:r>
+    </w:p>
+    <w:p>
+      <w:pPr>
+        <w:pStyle w:val="NormalWeb"/>
+        <w:shd w:val="clear" w:color="auto" w:fill="FFFFFF"/>
+        <w:spacing w:before="0" w:beforeAutospacing="0" w:after="0" w:afterAutospacing="0"/>
+        <w:rPr>
+          <w:rFonts w:ascii="Consolas" w:hAnsi="Consolas"/>
+          <w:color w:val="000000"/>
+          <w:sz w:val="20"/>
+          <w:szCs w:val="20"/>
+          <w:lang w:val="fr-BE"/>
+        </w:rPr>
+      </w:pPr>
+      <w:r>
+        <w:rPr>
+          <w:rFonts w:ascii="Consolas" w:hAnsi="Consolas"/>
+          <w:color w:val="000000"/>
+          <w:sz w:val="20"/>
+          <w:szCs w:val="20"/>
+          <w:lang w:val="fr-BE"/>
+        </w:rPr>
+        <w:t>- L'affichage des réponses promues ne se fait que partiellementpeut etre que le "hasard" pour choisir la meilleure réponse est "frustrant". Peut etre que les gens devraient pouvoir voter en donnant 3 à leur première réponse, 2 à la deuxieme, 1 a la dernière... Des bonnes idées se perdentIl pourrait être utile de laisser l'utilisateur effacer ces idées lui-même.</w:t>
+      </w:r>
+    </w:p>
+    <w:p>
+      <w:pPr>
+        <w:pStyle w:val="NormalWeb"/>
+        <w:shd w:val="clear" w:color="auto" w:fill="FFFFFF"/>
+        <w:spacing w:before="0" w:beforeAutospacing="0" w:after="0" w:afterAutospacing="0"/>
+        <w:rPr>
+          <w:rFonts w:ascii="Consolas" w:hAnsi="Consolas"/>
+          <w:color w:val="000000"/>
+          <w:sz w:val="20"/>
+          <w:szCs w:val="20"/>
+          <w:lang w:val="fr-BE"/>
+        </w:rPr>
+      </w:pPr>
+      <w:r>
+        <w:rPr>
+          <w:rFonts w:ascii="Consolas" w:hAnsi="Consolas"/>
+          <w:color w:val="000000"/>
+          <w:sz w:val="20"/>
+          <w:szCs w:val="20"/>
+          <w:lang w:val="fr-BE"/>
+        </w:rPr>
+        <w:t>Cela demande une certaine expérience poru bien exploiter l'outil.</w:t>
+      </w:r>
+    </w:p>
+    <w:p>
+      <w:pPr>
+        <w:pStyle w:val="NormalWeb"/>
+        <w:shd w:val="clear" w:color="auto" w:fill="FFFFFF"/>
+        <w:spacing w:before="0" w:beforeAutospacing="0" w:after="0" w:afterAutospacing="0"/>
+        <w:rPr>
+          <w:rFonts w:ascii="Consolas" w:hAnsi="Consolas"/>
+          <w:color w:val="000000"/>
+          <w:sz w:val="20"/>
+          <w:szCs w:val="20"/>
+          <w:lang w:val="fr-BE"/>
+        </w:rPr>
+      </w:pPr>
+      <w:r>
+        <w:rPr>
+          <w:rFonts w:ascii="Consolas" w:hAnsi="Consolas"/>
+          <w:color w:val="000000"/>
+          <w:sz w:val="20"/>
+          <w:szCs w:val="20"/>
+          <w:lang w:val="fr-BE"/>
+        </w:rPr>
+        <w:t>Avoir la possibilité de sauver une idée pour facilement la resoumettre après</w:t>
+      </w:r>
+    </w:p>
+    <w:p>
+      <w:pPr>
+        <w:rPr>
+          <w:lang w:val="fr-BE"/>
+        </w:rPr>
+      </w:pPr>
+    </w:p>
+    <w:p>
+      <w:pPr>
+        <w:rPr>
+          <w:lang w:val="fr-BE"/>
+        </w:rPr>
+      </w:pPr>
+    </w:p>
+    <w:p>
+      <w:pPr>
+        <w:rPr>
+          <w:lang w:val="fr-BE"/>
+        </w:rPr>
+      </w:pPr>
+      <w:r>
+        <w:rPr>
+          <w:lang w:val="fr-BE"/>
+        </w:rPr>
+        <w:t>Mail Quentin :</w:t>
+      </w:r>
+    </w:p>
+    <w:p>
+      <w:pPr>
+        <w:rPr>
+          <w:rFonts w:ascii="Arial" w:hAnsi="Arial" w:cs="Arial"/>
+          <w:color w:val="222222"/>
+          <w:shd w:val="clear" w:color="auto" w:fill="FFFFFF"/>
+          <w:lang w:val="fr-BE"/>
+        </w:rPr>
+      </w:pPr>
+      <w:r>
+        <w:rPr>
+          <w:rFonts w:ascii="Arial" w:hAnsi="Arial" w:cs="Arial"/>
+          <w:color w:val="222222"/>
+          <w:shd w:val="clear" w:color="auto" w:fill="FFFFFF"/>
+          <w:lang w:val="fr-BE"/>
+        </w:rPr>
+        <w:t>- La gestion du temps était compliqué</w:t>
+      </w:r>
+      <w:r>
+        <w:rPr>
+          <w:rFonts w:ascii="Arial" w:hAnsi="Arial" w:cs="Arial"/>
+          <w:color w:val="222222"/>
+          <w:lang w:val="fr-BE"/>
+        </w:rPr>
+        <w:br/>
+      </w:r>
+      <w:r>
+        <w:rPr>
+          <w:rFonts w:ascii="Arial" w:hAnsi="Arial" w:cs="Arial"/>
+          <w:color w:val="222222"/>
+          <w:shd w:val="clear" w:color="auto" w:fill="FFFFFF"/>
+          <w:lang w:val="fr-BE"/>
+        </w:rPr>
+        <w:t>- et je suis impressionné par le résultat final de notre histoire! Qu'est-ce que ça donnerait avec 100 participants? Il faudrait encore plus de temps pour la partie vote nn?</w:t>
+      </w:r>
+    </w:p>
+    <w:p>
+      <w:pPr>
+        <w:rPr>
+          <w:rFonts w:ascii="Arial" w:hAnsi="Arial" w:cs="Arial"/>
+          <w:color w:val="222222"/>
+          <w:shd w:val="clear" w:color="auto" w:fill="FFFFFF"/>
+          <w:lang w:val="fr-BE"/>
+        </w:rPr>
+      </w:pPr>
+    </w:p>
+    <w:p>
+      <w:pPr>
+        <w:rPr>
+          <w:rFonts w:ascii="Arial" w:hAnsi="Arial" w:cs="Arial"/>
+          <w:color w:val="222222"/>
+          <w:shd w:val="clear" w:color="auto" w:fill="FFFFFF"/>
+          <w:lang w:val="fr-BE"/>
+        </w:rPr>
+      </w:pPr>
+      <w:r>
+        <w:rPr>
+          <w:rFonts w:ascii="Arial" w:hAnsi="Arial" w:cs="Arial"/>
+          <w:color w:val="222222"/>
+          <w:shd w:val="clear" w:color="auto" w:fill="FFFFFF"/>
+          <w:lang w:val="fr-BE"/>
+        </w:rPr>
+        <w:t xml:space="preserve">Autre : </w:t>
+      </w:r>
+    </w:p>
+    <w:p>
+      <w:pPr>
+        <w:pStyle w:val="ListParagraph"/>
+        <w:numPr>
+          <w:ilvl w:val="0"/>
+          <w:numId w:val="1"/>
+        </w:numPr>
+        <w:rPr>
+          <w:lang w:val="fr-BE"/>
+        </w:rPr>
+      </w:pPr>
+      <w:r>
+        <w:rPr>
+          <w:lang w:val="fr-BE"/>
+        </w:rPr>
+        <w:t>Sur le chromebook utilisé par Maman la page était zoomée, du coup elle avait du mal à voir les proposition des autres.</w:t>
+      </w:r>
+    </w:p>
+    <w:p>
+      <w:pPr>
+        <w:pStyle w:val="ListParagraph"/>
+        <w:numPr>
+          <w:ilvl w:val="0"/>
+          <w:numId w:val="1"/>
+        </w:numPr>
+        <w:rPr>
+          <w:lang w:val="fr-BE"/>
+        </w:rPr>
+      </w:pPr>
+      <w:r>
+        <w:rPr>
+          <w:lang w:val="fr-BE"/>
+        </w:rPr>
+        <w:t>Mams : je ne vois pas l’utilisation de cet outil pour des réunions professionnels ou des décisions de groupe.</w:t>
+      </w:r>
       <w:bookmarkStart w:id="0" w:name="_GoBack"/>
       <w:bookmarkEnd w:id="0"/>
     </w:p>
@@ -25,15 +290,137 @@
         <w:rPr>
           <w:lang w:val="fr-BE"/>
         </w:rPr>
-        <w:t>Apparance de l’interface coopia</w:t>
-      </w:r>
-    </w:p>
-    <w:p>
-      <w:pPr>
-        <w:rPr>
-          <w:lang w:val="fr-BE"/>
-        </w:rPr>
-      </w:pPr>
+        <w:lastRenderedPageBreak/>
+        <w:t>Appare</w:t>
+      </w:r>
+      <w:r>
+        <w:rPr>
+          <w:lang w:val="fr-BE"/>
+        </w:rPr>
+        <w:t>nce de l’interface coopia</w:t>
+      </w:r>
+    </w:p>
+    <w:p>
+      <w:pPr>
+        <w:rPr>
+          <w:lang w:val="fr-BE"/>
+        </w:rPr>
+      </w:pPr>
+      <w:r>
+        <w:rPr>
+          <w:noProof/>
+          <w:lang w:eastAsia="en-GB"/>
+        </w:rPr>
+        <w:drawing>
+          <wp:inline distT="0" distB="0" distL="0" distR="0">
+            <wp:extent cx="5760720" cy="4236720"/>
+            <wp:effectExtent l="0" t="0" r="0" b="0"/>
+            <wp:docPr id="1" name="Picture 1"/>
+            <wp:cNvGraphicFramePr>
+              <a:graphicFrameLocks xmlns:a="http://schemas.openxmlformats.org/drawingml/2006/main" noChangeAspect="1"/>
+            </wp:cNvGraphicFramePr>
+            <a:graphic xmlns:a="http://schemas.openxmlformats.org/drawingml/2006/main">
+              <a:graphicData uri="http://schemas.openxmlformats.org/drawingml/2006/picture">
+                <pic:pic xmlns:pic="http://schemas.openxmlformats.org/drawingml/2006/picture">
+                  <pic:nvPicPr>
+                    <pic:cNvPr id="0" name="Picture 1"/>
+                    <pic:cNvPicPr>
+                      <a:picLocks noChangeAspect="1" noChangeArrowheads="1"/>
+                    </pic:cNvPicPr>
+                  </pic:nvPicPr>
+                  <pic:blipFill>
+                    <a:blip r:embed="rId5">
+                      <a:extLst>
+                        <a:ext uri="{28A0092B-C50C-407E-A947-70E740481C1C}">
+                          <a14:useLocalDpi xmlns:a14="http://schemas.microsoft.com/office/drawing/2010/main" val="0"/>
+                        </a:ext>
+                      </a:extLst>
+                    </a:blip>
+                    <a:srcRect/>
+                    <a:stretch>
+                      <a:fillRect/>
+                    </a:stretch>
+                  </pic:blipFill>
+                  <pic:spPr bwMode="auto">
+                    <a:xfrm>
+                      <a:off x="0" y="0"/>
+                      <a:ext cx="5760720" cy="4236720"/>
+                    </a:xfrm>
+                    <a:prstGeom prst="rect">
+                      <a:avLst/>
+                    </a:prstGeom>
+                    <a:noFill/>
+                    <a:ln>
+                      <a:noFill/>
+                    </a:ln>
+                  </pic:spPr>
+                </pic:pic>
+              </a:graphicData>
+            </a:graphic>
+          </wp:inline>
+        </w:drawing>
+      </w:r>
+    </w:p>
+    <w:p>
+      <w:pPr>
+        <w:rPr>
+          <w:lang w:val="fr-BE"/>
+        </w:rPr>
+      </w:pPr>
+      <w:r>
+        <w:rPr>
+          <w:noProof/>
+          <w:lang w:eastAsia="en-GB"/>
+        </w:rPr>
+        <w:drawing>
+          <wp:inline distT="0" distB="0" distL="0" distR="0">
+            <wp:extent cx="5753100" cy="3444240"/>
+            <wp:effectExtent l="0" t="0" r="0" b="3810"/>
+            <wp:docPr id="2" name="Picture 2"/>
+            <wp:cNvGraphicFramePr>
+              <a:graphicFrameLocks xmlns:a="http://schemas.openxmlformats.org/drawingml/2006/main" noChangeAspect="1"/>
+            </wp:cNvGraphicFramePr>
+            <a:graphic xmlns:a="http://schemas.openxmlformats.org/drawingml/2006/main">
+              <a:graphicData uri="http://schemas.openxmlformats.org/drawingml/2006/picture">
+                <pic:pic xmlns:pic="http://schemas.openxmlformats.org/drawingml/2006/picture">
+                  <pic:nvPicPr>
+                    <pic:cNvPr id="0" name="Picture 2"/>
+                    <pic:cNvPicPr>
+                      <a:picLocks noChangeAspect="1" noChangeArrowheads="1"/>
+                    </pic:cNvPicPr>
+                  </pic:nvPicPr>
+                  <pic:blipFill>
+                    <a:blip r:embed="rId6">
+                      <a:extLst>
+                        <a:ext uri="{28A0092B-C50C-407E-A947-70E740481C1C}">
+                          <a14:useLocalDpi xmlns:a14="http://schemas.microsoft.com/office/drawing/2010/main" val="0"/>
+                        </a:ext>
+                      </a:extLst>
+                    </a:blip>
+                    <a:srcRect/>
+                    <a:stretch>
+                      <a:fillRect/>
+                    </a:stretch>
+                  </pic:blipFill>
+                  <pic:spPr bwMode="auto">
+                    <a:xfrm>
+                      <a:off x="0" y="0"/>
+                      <a:ext cx="5753100" cy="3444240"/>
+                    </a:xfrm>
+                    <a:prstGeom prst="rect">
+                      <a:avLst/>
+                    </a:prstGeom>
+                    <a:noFill/>
+                    <a:ln>
+                      <a:noFill/>
+                    </a:ln>
+                  </pic:spPr>
+                </pic:pic>
+              </a:graphicData>
+            </a:graphic>
+          </wp:inline>
+        </w:drawing>
+      </w:r>
     </w:p>
     <w:p>
       <w:pPr>
@@ -55,7 +442,7 @@
           <w:lang w:val="fr-BE"/>
         </w:rPr>
       </w:pPr>
-      <w:hyperlink r:id="rId4" w:history="1">
+      <w:hyperlink r:id="rId7" w:history="1">
         <w:r>
           <w:rPr>
             <w:rStyle w:val="Hyperlink"/>
@@ -75,6 +462,7 @@
         <w:rPr>
           <w:lang w:val="fr-BE"/>
         </w:rPr>
+        <w:lastRenderedPageBreak/>
         <w:t>round duration : 30</w:t>
       </w:r>
     </w:p>
@@ -216,7 +604,7 @@
           <w:lang w:val="fr-BE"/>
         </w:rPr>
       </w:pPr>
-      <w:hyperlink r:id="rId5" w:history="1">
+      <w:hyperlink r:id="rId8" w:history="1">
         <w:r>
           <w:rPr>
             <w:rStyle w:val="Hyperlink"/>
@@ -284,7 +672,7 @@
           <w:lang w:val="fr-BE"/>
         </w:rPr>
       </w:pPr>
-      <w:hyperlink r:id="rId6" w:history="1">
+      <w:hyperlink r:id="rId9" w:history="1">
         <w:r>
           <w:rPr>
             <w:rStyle w:val="Hyperlink"/>
@@ -304,19 +692,7 @@
         <w:rPr>
           <w:lang w:val="fr-BE"/>
         </w:rPr>
-        <w:t>round duration :</w:t>
-      </w:r>
-      <w:r>
-        <w:rPr>
-          <w:lang w:val="fr-BE"/>
-        </w:rPr>
-        <w:t xml:space="preserve"> 6</w:t>
-      </w:r>
-      <w:r>
-        <w:rPr>
-          <w:lang w:val="fr-BE"/>
-        </w:rPr>
-        <w:t>0</w:t>
+        <w:t>round duration : 60</w:t>
       </w:r>
     </w:p>
     <w:p>
@@ -366,7 +742,7 @@
           <w:lang w:val="fr-BE"/>
         </w:rPr>
       </w:pPr>
-      <w:hyperlink r:id="rId7" w:history="1">
+      <w:hyperlink r:id="rId10" w:history="1">
         <w:r>
           <w:rPr>
             <w:rStyle w:val="Hyperlink"/>
@@ -457,6 +833,127 @@
     </w:sectPr>
   </w:body>
 </w:document>
+</file>
+
+<file path=word/numbering.xml><?xml version="1.0" encoding="utf-8"?>
+<w:numbering xmlns:wpc="http://schemas.microsoft.com/office/word/2010/wordprocessingCanvas" xmlns:cx="http://schemas.microsoft.com/office/drawing/2014/chartex" xmlns:mc="http://schemas.openxmlformats.org/markup-compatibility/2006" xmlns:o="urn:schemas-microsoft-com:office:office" xmlns:r="http://schemas.openxmlformats.org/officeDocument/2006/relationships" xmlns:m="http://schemas.openxmlformats.org/officeDocument/2006/math" xmlns:v="urn:schemas-microsoft-com:vml" xmlns:wp14="http://schemas.microsoft.com/office/word/2010/wordprocessingDrawing" xmlns:wp="http://schemas.openxmlformats.org/drawingml/2006/wordprocessingDrawing" xmlns:w10="urn:schemas-microsoft-com:office:word" xmlns:w="http://schemas.openxmlformats.org/wordprocessingml/2006/main" xmlns:w14="http://schemas.microsoft.com/office/word/2010/wordml" xmlns:w15="http://schemas.microsoft.com/office/word/2012/wordml" xmlns:w16se="http://schemas.microsoft.com/office/word/2015/wordml/symex" xmlns:wpg="http://schemas.microsoft.com/office/word/2010/wordprocessingGroup" xmlns:wpi="http://schemas.microsoft.com/office/word/2010/wordprocessingInk" xmlns:wne="http://schemas.microsoft.com/office/word/2006/wordml" xmlns:wps="http://schemas.microsoft.com/office/word/2010/wordprocessingShape" mc:Ignorable="w14 w15 w16se wp14">
+  <w:abstractNum w:abstractNumId="0" w15:restartNumberingAfterBreak="0">
+    <w:nsid w:val="1FD43FC7"/>
+    <w:multiLevelType w:val="hybridMultilevel"/>
+    <w:tmpl w:val="2F927A40"/>
+    <w:lvl w:ilvl="0" w:tplc="7D662712">
+      <w:numFmt w:val="bullet"/>
+      <w:lvlText w:val="-"/>
+      <w:lvlJc w:val="left"/>
+      <w:pPr>
+        <w:ind w:left="720" w:hanging="360"/>
+      </w:pPr>
+      <w:rPr>
+        <w:rFonts w:ascii="Arial" w:eastAsiaTheme="minorHAnsi" w:hAnsi="Arial" w:cs="Arial" w:hint="default"/>
+        <w:color w:val="222222"/>
+      </w:rPr>
+    </w:lvl>
+    <w:lvl w:ilvl="1" w:tplc="08090003" w:tentative="1">
+      <w:start w:val="1"/>
+      <w:numFmt w:val="bullet"/>
+      <w:lvlText w:val="o"/>
+      <w:lvlJc w:val="left"/>
+      <w:pPr>
+        <w:ind w:left="1440" w:hanging="360"/>
+      </w:pPr>
+      <w:rPr>
+        <w:rFonts w:ascii="Courier New" w:hAnsi="Courier New" w:cs="Courier New" w:hint="default"/>
+      </w:rPr>
+    </w:lvl>
+    <w:lvl w:ilvl="2" w:tplc="08090005" w:tentative="1">
+      <w:start w:val="1"/>
+      <w:numFmt w:val="bullet"/>
+      <w:lvlText w:val=""/>
+      <w:lvlJc w:val="left"/>
+      <w:pPr>
+        <w:ind w:left="2160" w:hanging="360"/>
+      </w:pPr>
+      <w:rPr>
+        <w:rFonts w:ascii="Wingdings" w:hAnsi="Wingdings" w:hint="default"/>
+      </w:rPr>
+    </w:lvl>
+    <w:lvl w:ilvl="3" w:tplc="08090001" w:tentative="1">
+      <w:start w:val="1"/>
+      <w:numFmt w:val="bullet"/>
+      <w:lvlText w:val=""/>
+      <w:lvlJc w:val="left"/>
+      <w:pPr>
+        <w:ind w:left="2880" w:hanging="360"/>
+      </w:pPr>
+      <w:rPr>
+        <w:rFonts w:ascii="Symbol" w:hAnsi="Symbol" w:hint="default"/>
+      </w:rPr>
+    </w:lvl>
+    <w:lvl w:ilvl="4" w:tplc="08090003" w:tentative="1">
+      <w:start w:val="1"/>
+      <w:numFmt w:val="bullet"/>
+      <w:lvlText w:val="o"/>
+      <w:lvlJc w:val="left"/>
+      <w:pPr>
+        <w:ind w:left="3600" w:hanging="360"/>
+      </w:pPr>
+      <w:rPr>
+        <w:rFonts w:ascii="Courier New" w:hAnsi="Courier New" w:cs="Courier New" w:hint="default"/>
+      </w:rPr>
+    </w:lvl>
+    <w:lvl w:ilvl="5" w:tplc="08090005" w:tentative="1">
+      <w:start w:val="1"/>
+      <w:numFmt w:val="bullet"/>
+      <w:lvlText w:val=""/>
+      <w:lvlJc w:val="left"/>
+      <w:pPr>
+        <w:ind w:left="4320" w:hanging="360"/>
+      </w:pPr>
+      <w:rPr>
+        <w:rFonts w:ascii="Wingdings" w:hAnsi="Wingdings" w:hint="default"/>
+      </w:rPr>
+    </w:lvl>
+    <w:lvl w:ilvl="6" w:tplc="08090001" w:tentative="1">
+      <w:start w:val="1"/>
+      <w:numFmt w:val="bullet"/>
+      <w:lvlText w:val=""/>
+      <w:lvlJc w:val="left"/>
+      <w:pPr>
+        <w:ind w:left="5040" w:hanging="360"/>
+      </w:pPr>
+      <w:rPr>
+        <w:rFonts w:ascii="Symbol" w:hAnsi="Symbol" w:hint="default"/>
+      </w:rPr>
+    </w:lvl>
+    <w:lvl w:ilvl="7" w:tplc="08090003" w:tentative="1">
+      <w:start w:val="1"/>
+      <w:numFmt w:val="bullet"/>
+      <w:lvlText w:val="o"/>
+      <w:lvlJc w:val="left"/>
+      <w:pPr>
+        <w:ind w:left="5760" w:hanging="360"/>
+      </w:pPr>
+      <w:rPr>
+        <w:rFonts w:ascii="Courier New" w:hAnsi="Courier New" w:cs="Courier New" w:hint="default"/>
+      </w:rPr>
+    </w:lvl>
+    <w:lvl w:ilvl="8" w:tplc="08090005" w:tentative="1">
+      <w:start w:val="1"/>
+      <w:numFmt w:val="bullet"/>
+      <w:lvlText w:val=""/>
+      <w:lvlJc w:val="left"/>
+      <w:pPr>
+        <w:ind w:left="6480" w:hanging="360"/>
+      </w:pPr>
+      <w:rPr>
+        <w:rFonts w:ascii="Wingdings" w:hAnsi="Wingdings" w:hint="default"/>
+      </w:rPr>
+    </w:lvl>
+  </w:abstractNum>
+  <w:num w:numId="1">
+    <w:abstractNumId w:val="0"/>
+  </w:num>
+</w:numbering>
 </file>
 
 <file path=word/styles.xml><?xml version="1.0" encoding="utf-8"?>
@@ -925,6 +1422,34 @@
       <w:szCs w:val="32"/>
     </w:rPr>
   </w:style>
+  <w:style w:type="paragraph" w:styleId="NormalWeb">
+    <w:name w:val="Normal (Web)"/>
+    <w:basedOn w:val="Normal"/>
+    <w:uiPriority w:val="99"/>
+    <w:semiHidden/>
+    <w:unhideWhenUsed/>
+    <w:rsid w:val="00503C23"/>
+    <w:pPr>
+      <w:spacing w:before="100" w:beforeAutospacing="1" w:after="100" w:afterAutospacing="1" w:line="240" w:lineRule="auto"/>
+    </w:pPr>
+    <w:rPr>
+      <w:rFonts w:ascii="Times New Roman" w:eastAsia="Times New Roman" w:hAnsi="Times New Roman" w:cs="Times New Roman"/>
+      <w:sz w:val="24"/>
+      <w:szCs w:val="24"/>
+      <w:lang w:eastAsia="en-GB"/>
+    </w:rPr>
+  </w:style>
+  <w:style w:type="paragraph" w:styleId="ListParagraph">
+    <w:name w:val="List Paragraph"/>
+    <w:basedOn w:val="Normal"/>
+    <w:uiPriority w:val="34"/>
+    <w:qFormat/>
+    <w:rsid w:val="00503C23"/>
+    <w:pPr>
+      <w:ind w:left="720"/>
+      <w:contextualSpacing/>
+    </w:pPr>
+  </w:style>
 </w:styles>
 </file>
 

</xml_diff>